<commit_message>
Replace ONPG worksheet with exact user-uploaded Word document
</commit_message>
<xml_diff>
--- a/labs/onpg/ONPG_Worksheet.docx
+++ b/labs/onpg/ONPG_Worksheet.docx
@@ -800,21 +800,7 @@
         <w:rPr>
           <w:sz w:val="22"/>
         </w:rPr>
-        <w:t xml:space="preserve"> Fig. 1. The two laboratory bead sizes are shown </w:t>
-      </w:r>
-      <w:proofErr w:type="gramStart"/>
-      <w:r>
-        <w:rPr>
-          <w:sz w:val="22"/>
-        </w:rPr>
-        <w:t>in</w:t>
-      </w:r>
-      <w:proofErr w:type="gramEnd"/>
-      <w:r>
-        <w:rPr>
-          <w:sz w:val="22"/>
-        </w:rPr>
-        <w:t xml:space="preserve"> Fig. 2.</w:t>
+        <w:t xml:space="preserve"> Fig. 1. The two laboratory bead sizes are shown in Fig. 2.</w:t>
       </w:r>
     </w:p>
     <w:p>
@@ -873,21 +859,7 @@
         <w:rPr>
           <w:sz w:val="22"/>
         </w:rPr>
-        <w:t xml:space="preserve">Fig. </w:t>
-      </w:r>
-      <w:proofErr w:type="gramStart"/>
-      <w:r>
-        <w:rPr>
-          <w:sz w:val="22"/>
-        </w:rPr>
-        <w:t>1  Recirculating</w:t>
-      </w:r>
-      <w:proofErr w:type="gramEnd"/>
-      <w:r>
-        <w:rPr>
-          <w:sz w:val="22"/>
-        </w:rPr>
-        <w:t xml:space="preserve"> immobilized-enzyme apparatus used to motivate the Stages 4–6 simulation.</w:t>
+        <w:t>Fig. 1  Recirculating immobilized-enzyme apparatus used to motivate the Stages 4–6 simulation.</w:t>
       </w:r>
     </w:p>
     <w:p>
@@ -1002,21 +974,7 @@
         <w:rPr>
           <w:sz w:val="22"/>
         </w:rPr>
-        <w:t xml:space="preserve">Before each run, the experimentalist obtains a baseline absorbance for the clear ONPG-containing liquid and zeroes the spectrophotometer. This subtracts background </w:t>
-      </w:r>
-      <w:proofErr w:type="gramStart"/>
-      <w:r>
-        <w:rPr>
-          <w:sz w:val="22"/>
-        </w:rPr>
-        <w:t>absorption</w:t>
-      </w:r>
-      <w:proofErr w:type="gramEnd"/>
-      <w:r>
-        <w:rPr>
-          <w:sz w:val="22"/>
-        </w:rPr>
-        <w:t xml:space="preserve"> so the remaining 415 nm signal is attributed to ONP formation.</w:t>
+        <w:t>Before each run, the experimentalist obtains a baseline absorbance for the clear ONPG-containing liquid and zeroes the spectrophotometer. This subtracts background absorption so the remaining 415 nm signal is attributed to ONP formation.</w:t>
       </w:r>
     </w:p>
     <w:p>
@@ -1024,15 +982,7 @@
         <w:keepLines/>
       </w:pPr>
       <w:r>
-        <w:t xml:space="preserve">Before measuring ONP, blank the spectrophotometer using a clear liquid reference. The reference cuvette </w:t>
-      </w:r>
-      <w:proofErr w:type="gramStart"/>
-      <w:r>
-        <w:t>at left</w:t>
-      </w:r>
-      <w:proofErr w:type="gramEnd"/>
-      <w:r>
-        <w:t xml:space="preserve"> is not empty. The seven Stage 1 assay cuvettes have equal enzyme amounts but different initial ONPG concentrations; their yellow color represents ONP formation during the scan.</w:t>
+        <w:t>Before measuring ONP, blank the spectrophotometer using a clear liquid reference. The reference cuvette at left is not empty. The seven Stage 1 assay cuvettes have equal enzyme amounts but different initial ONPG concentrations; their yellow color represents ONP formation during the scan.</w:t>
       </w:r>
     </w:p>
     <w:p>
@@ -1088,15 +1038,7 @@
         <w:jc w:val="center"/>
       </w:pPr>
       <w:r>
-        <w:t xml:space="preserve">Fig. </w:t>
-      </w:r>
-      <w:proofErr w:type="gramStart"/>
-      <w:r>
-        <w:t>3  Clear</w:t>
-      </w:r>
-      <w:proofErr w:type="gramEnd"/>
-      <w:r>
-        <w:t xml:space="preserve"> reference blank (left) and seven Stage 1 ONPG assay cuvettes (right). Stronger yellow represents greater ONP formation.</w:t>
+        <w:t>Fig. 3  Clear reference blank (left) and seven Stage 1 ONPG assay cuvettes (right). Stronger yellow represents greater ONP formation.</w:t>
       </w:r>
     </w:p>
     <w:p>
@@ -1115,21 +1057,7 @@
         <w:rPr>
           <w:sz w:val="20"/>
         </w:rPr>
-        <w:t>Figure 4 shows eight experimental ONP calibration points and the fitted line. The horizontal axis is ONP concentration [mM</w:t>
-      </w:r>
-      <w:proofErr w:type="gramStart"/>
-      <w:r>
-        <w:rPr>
-          <w:sz w:val="20"/>
-        </w:rPr>
-        <w:t>]</w:t>
-      </w:r>
-      <w:proofErr w:type="gramEnd"/>
-      <w:r>
-        <w:rPr>
-          <w:sz w:val="20"/>
-        </w:rPr>
-        <w:t xml:space="preserve"> and the vertical axis is absorbance at 415 nm. Use 3.43 mM</w:t>
+        <w:t>Figure 4 shows eight experimental ONP calibration points and the fitted line. The horizontal axis is ONP concentration [mM] and the vertical axis is absorbance at 415 nm. Use 3.43 mM</w:t>
       </w:r>
       <w:r>
         <w:rPr>
@@ -1177,15 +1105,7 @@
         <w:jc w:val="center"/>
       </w:pPr>
       <w:r>
-        <w:t xml:space="preserve">Fig. </w:t>
-      </w:r>
-      <w:proofErr w:type="gramStart"/>
-      <w:r>
-        <w:t>4  Experimental</w:t>
-      </w:r>
-      <w:proofErr w:type="gramEnd"/>
-      <w:r>
-        <w:t xml:space="preserve"> ONP calibration data.</w:t>
+        <w:t>Fig. 4  Experimental ONP calibration data.</w:t>
       </w:r>
     </w:p>
     <w:p>
@@ -2106,7 +2026,7 @@
         <w:t xml:space="preserve">1. Compare the slopes at 0.622 and 4.97 mM, and then at 19.9 and 39.8 mM ONPG. Explain why the rate increases more slowly as substrate becomes </w:t>
       </w:r>
       <w:r>
-        <w:t>trends</w:t>
+        <w:t>abundant</w:t>
       </w:r>
       <w:r>
         <w:t>.</w:t>
@@ -2711,10 +2631,7 @@
         <w:t xml:space="preserve">2. </w:t>
       </w:r>
       <w:r>
-        <w:t>Record</w:t>
-      </w:r>
-      <w:r>
-        <w:t xml:space="preserve"> the internal effectiveness factors and the surface and center ONPG concentrations for both diameters. Identify which one meets </w:t>
+        <w:t xml:space="preserve">Record the internal effectiveness factors and the surface and center ONPG concentrations for both diameters. Identify which one meets </w:t>
       </w:r>
       <m:oMath>
         <m:sSub>
@@ -2772,16 +2689,7 @@
         <w:t>3.</w:t>
       </w:r>
       <w:r>
-        <w:t xml:space="preserve"> </w:t>
-      </w:r>
-      <w:r>
-        <w:t xml:space="preserve">Compare the </w:t>
-      </w:r>
-      <w:r>
-        <w:t>four</w:t>
-      </w:r>
-      <w:r>
-        <w:t xml:space="preserve"> saved surface-to-center ONPG concentration profiles.</w:t>
+        <w:t xml:space="preserve"> Compare the four saved surface-to-center ONPG concentration profiles.</w:t>
       </w:r>
     </w:p>
     <w:p>
@@ -6904,43 +6812,7 @@
             <w:rPr>
               <w:rFonts w:ascii="Cambria Math" w:hAnsi="Cambria Math"/>
             </w:rPr>
-            <m:t>y=</m:t>
-          </m:r>
-          <m:r>
-            <w:rPr>
-              <w:rFonts w:ascii="Cambria Math" w:hAnsi="Cambria Math"/>
-            </w:rPr>
-            <m:t>(</m:t>
-          </m:r>
-          <m:r>
-            <w:rPr>
-              <w:rFonts w:ascii="Cambria Math" w:hAnsi="Cambria Math"/>
-            </w:rPr>
-            <m:t>m</m:t>
-          </m:r>
-          <m:r>
-            <w:rPr>
-              <w:rFonts w:ascii="Cambria Math" w:hAnsi="Cambria Math"/>
-            </w:rPr>
-            <m:t>×</m:t>
-          </m:r>
-          <m:r>
-            <w:rPr>
-              <w:rFonts w:ascii="Cambria Math" w:hAnsi="Cambria Math"/>
-            </w:rPr>
-            <m:t>x</m:t>
-          </m:r>
-          <m:r>
-            <w:rPr>
-              <w:rFonts w:ascii="Cambria Math" w:hAnsi="Cambria Math"/>
-            </w:rPr>
-            <m:t>)</m:t>
-          </m:r>
-          <m:r>
-            <w:rPr>
-              <w:rFonts w:ascii="Cambria Math" w:hAnsi="Cambria Math"/>
-            </w:rPr>
-            <m:t>+b</m:t>
+            <m:t>y=(m×x)+b</m:t>
           </m:r>
         </m:oMath>
       </m:oMathPara>
@@ -8288,6 +8160,7 @@
   <w:style w:type="character" w:default="1" w:styleId="DefaultParagraphFont">
     <w:name w:val="Default Paragraph Font"/>
     <w:uiPriority w:val="1"/>
+    <w:semiHidden/>
     <w:unhideWhenUsed/>
   </w:style>
   <w:style w:type="table" w:default="1" w:styleId="TableNormal">
@@ -20546,7 +20419,14 @@
 </file>
 
 <file path=customXml/item2.xml><?xml version="1.0" encoding="utf-8"?>
-<b:Sources xmlns:b="http://schemas.openxmlformats.org/officeDocument/2006/bibliography" xmlns="http://schemas.openxmlformats.org/officeDocument/2006/bibliography" SelectedStyle="/APA.XSL" StyleName="APA"/>
+<p:properties xmlns:p="http://schemas.microsoft.com/office/2006/metadata/properties" xmlns:xsi="http://www.w3.org/2001/XMLSchema-instance" xmlns:pc="http://schemas.microsoft.com/office/infopath/2007/PartnerControls">
+  <documentManagement>
+    <TaxCatchAll xmlns="37341b61-bf69-4ecb-abd4-542b74be1465" xsi:nil="true"/>
+    <lcf76f155ced4ddcb4097134ff3c332f xmlns="9bcad664-a72d-40fc-9865-0cb46556d555">
+      <Terms xmlns="http://schemas.microsoft.com/office/infopath/2007/PartnerControls"/>
+    </lcf76f155ced4ddcb4097134ff3c332f>
+  </documentManagement>
+</p:properties>
 </file>
 
 <file path=customXml/item3.xml><?xml version="1.0" encoding="utf-8"?>
@@ -20811,14 +20691,7 @@
 </file>
 
 <file path=customXml/item4.xml><?xml version="1.0" encoding="utf-8"?>
-<p:properties xmlns:p="http://schemas.microsoft.com/office/2006/metadata/properties" xmlns:xsi="http://www.w3.org/2001/XMLSchema-instance" xmlns:pc="http://schemas.microsoft.com/office/infopath/2007/PartnerControls">
-  <documentManagement>
-    <TaxCatchAll xmlns="37341b61-bf69-4ecb-abd4-542b74be1465" xsi:nil="true"/>
-    <lcf76f155ced4ddcb4097134ff3c332f xmlns="9bcad664-a72d-40fc-9865-0cb46556d555">
-      <Terms xmlns="http://schemas.microsoft.com/office/infopath/2007/PartnerControls"/>
-    </lcf76f155ced4ddcb4097134ff3c332f>
-  </documentManagement>
-</p:properties>
+<b:Sources xmlns:b="http://schemas.openxmlformats.org/officeDocument/2006/bibliography" xmlns="http://schemas.openxmlformats.org/officeDocument/2006/bibliography" SelectedStyle="/APA.XSL" StyleName="APA"/>
 </file>
 
 <file path=customXml/itemProps1.xml><?xml version="1.0" encoding="utf-8"?>
@@ -20830,9 +20703,12 @@
 </file>
 
 <file path=customXml/itemProps2.xml><?xml version="1.0" encoding="utf-8"?>
-<ds:datastoreItem xmlns:ds="http://schemas.openxmlformats.org/officeDocument/2006/customXml" ds:itemID="{EF278816-EC6F-A645-907D-7F25AECB1D4A}">
+<ds:datastoreItem xmlns:ds="http://schemas.openxmlformats.org/officeDocument/2006/customXml" ds:itemID="{BC4570F3-5E88-462C-844F-A3ED2BB201C4}">
   <ds:schemaRefs>
-    <ds:schemaRef ds:uri="http://schemas.openxmlformats.org/officeDocument/2006/bibliography"/>
+    <ds:schemaRef ds:uri="http://schemas.microsoft.com/office/2006/metadata/properties"/>
+    <ds:schemaRef ds:uri="http://schemas.microsoft.com/office/infopath/2007/PartnerControls"/>
+    <ds:schemaRef ds:uri="37341b61-bf69-4ecb-abd4-542b74be1465"/>
+    <ds:schemaRef ds:uri="9bcad664-a72d-40fc-9865-0cb46556d555"/>
   </ds:schemaRefs>
 </ds:datastoreItem>
 </file>
@@ -20857,12 +20733,9 @@
 </file>
 
 <file path=customXml/itemProps4.xml><?xml version="1.0" encoding="utf-8"?>
-<ds:datastoreItem xmlns:ds="http://schemas.openxmlformats.org/officeDocument/2006/customXml" ds:itemID="{BC4570F3-5E88-462C-844F-A3ED2BB201C4}">
+<ds:datastoreItem xmlns:ds="http://schemas.openxmlformats.org/officeDocument/2006/customXml" ds:itemID="{EF278816-EC6F-A645-907D-7F25AECB1D4A}">
   <ds:schemaRefs>
-    <ds:schemaRef ds:uri="http://schemas.microsoft.com/office/2006/metadata/properties"/>
-    <ds:schemaRef ds:uri="http://schemas.microsoft.com/office/infopath/2007/PartnerControls"/>
-    <ds:schemaRef ds:uri="37341b61-bf69-4ecb-abd4-542b74be1465"/>
-    <ds:schemaRef ds:uri="9bcad664-a72d-40fc-9865-0cb46556d555"/>
+    <ds:schemaRef ds:uri="http://schemas.openxmlformats.org/officeDocument/2006/bibliography"/>
   </ds:schemaRefs>
 </ds:datastoreItem>
 </file>
</xml_diff>